<commit_message>
nuevo diagrama del modelo dimensional (png y pdf)
</commit_message>
<xml_diff>
--- a/Datos y conclusiones Fase 1.docx
+++ b/Datos y conclusiones Fase 1.docx
@@ -12884,7 +12884,7 @@
         </w:rPr>
         <w:drawing>
           <wp:inline distT="0" distB="0" distL="0" distR="0" wp14:anchorId="022F010F" wp14:editId="604842BC">
-            <wp:extent cx="5940000" cy="4867941"/>
+            <wp:extent cx="5940000" cy="5809964"/>
             <wp:effectExtent l="0" t="0" r="0" b="0"/>
             <wp:docPr id="1" name="Picture 1"/>
             <wp:cNvGraphicFramePr>
@@ -12906,7 +12906,7 @@
                   <pic:spPr>
                     <a:xfrm>
                       <a:off x="0" y="0"/>
-                      <a:ext cx="5940000" cy="4867941"/>
+                      <a:ext cx="5940000" cy="5809964"/>
                     </a:xfrm>
                     <a:prstGeom prst="rect">
                       <a:avLst/>

</xml_diff>

<commit_message>
evidencia de las corridas en mi computadora y pasos de instalación
</commit_message>
<xml_diff>
--- a/Datos y conclusiones Fase 1.docx
+++ b/Datos y conclusiones Fase 1.docx
@@ -10652,7 +10652,7 @@
                 <w:sz w:val="19"/>
                 <w:lang w:val="es-GT"/>
               </w:rPr>
-              <w:t>Fecha 2027-08-17 06:54:16 posterior a la ingesta 2026-09-23 14:31:32.223327</w:t>
+              <w:t>Fecha 2027-08-17 06:54:16 posterior a la ingesta 2026-09-23 18:50:56.868958</w:t>
             </w:r>
           </w:p>
         </w:tc>
@@ -14695,7 +14695,7 @@
           <w:rFonts w:ascii="Arial" w:hAnsi="Arial" w:cs="Arial"/>
           <w:lang w:val="es-GT"/>
         </w:rPr>
-        <w:t>Corrimos el flujo desde cero (2026-09-23 14:32:33), contamos, lo volvimos a correr (2026-09-23 14:33:25) y contamos otra vez. Resultado de herramientas/comparar.py:</w:t>
+        <w:t>Corrimos el flujo desde cero (2026-09-23 18:52:27), contamos, lo volvimos a correr (2026-09-23 18:55:50) y contamos otra vez. Resultado de herramientas/comparar.py:</w:t>
       </w:r>
     </w:p>
     <w:p>
@@ -16578,7 +16578,7 @@
                 <w:rFonts w:ascii="Arial" w:hAnsi="Arial" w:cs="Arial"/>
                 <w:sz w:val="19"/>
               </w:rPr>
-              <w:t>1.39</w:t>
+              <w:t>2.75</w:t>
             </w:r>
           </w:p>
         </w:tc>
@@ -16598,7 +16598,7 @@
                 <w:rFonts w:ascii="Arial" w:hAnsi="Arial" w:cs="Arial"/>
                 <w:sz w:val="19"/>
               </w:rPr>
-              <w:t>0.24</w:t>
+              <w:t>0.42</w:t>
             </w:r>
           </w:p>
         </w:tc>
@@ -16642,7 +16642,7 @@
                 <w:rFonts w:ascii="Arial" w:hAnsi="Arial" w:cs="Arial"/>
                 <w:sz w:val="19"/>
               </w:rPr>
-              <w:t>0.22</w:t>
+              <w:t>0.28</w:t>
             </w:r>
           </w:p>
         </w:tc>
@@ -16662,7 +16662,7 @@
                 <w:rFonts w:ascii="Arial" w:hAnsi="Arial" w:cs="Arial"/>
                 <w:sz w:val="19"/>
               </w:rPr>
-              <w:t>0.04</w:t>
+              <w:t>0.07</w:t>
             </w:r>
           </w:p>
         </w:tc>
@@ -16706,7 +16706,7 @@
                 <w:rFonts w:ascii="Arial" w:hAnsi="Arial" w:cs="Arial"/>
                 <w:sz w:val="19"/>
               </w:rPr>
-              <w:t>12.53</w:t>
+              <w:t>17.69</w:t>
             </w:r>
           </w:p>
         </w:tc>
@@ -16726,7 +16726,7 @@
                 <w:rFonts w:ascii="Arial" w:hAnsi="Arial" w:cs="Arial"/>
                 <w:sz w:val="19"/>
               </w:rPr>
-              <w:t>0.10</w:t>
+              <w:t>0.17</w:t>
             </w:r>
           </w:p>
         </w:tc>
@@ -16770,7 +16770,7 @@
                 <w:rFonts w:ascii="Arial" w:hAnsi="Arial" w:cs="Arial"/>
                 <w:sz w:val="19"/>
               </w:rPr>
-              <w:t>0.03</w:t>
+              <w:t>0.05</w:t>
             </w:r>
           </w:p>
         </w:tc>
@@ -16790,7 +16790,7 @@
                 <w:rFonts w:ascii="Arial" w:hAnsi="Arial" w:cs="Arial"/>
                 <w:sz w:val="19"/>
               </w:rPr>
-              <w:t>0.06</w:t>
+              <w:t>0.07</w:t>
             </w:r>
           </w:p>
         </w:tc>
@@ -16834,7 +16834,7 @@
                 <w:rFonts w:ascii="Arial" w:hAnsi="Arial" w:cs="Arial"/>
                 <w:sz w:val="19"/>
               </w:rPr>
-              <w:t>47.99</w:t>
+              <w:t>71.39</w:t>
             </w:r>
           </w:p>
         </w:tc>
@@ -16854,7 +16854,7 @@
                 <w:rFonts w:ascii="Arial" w:hAnsi="Arial" w:cs="Arial"/>
                 <w:sz w:val="19"/>
               </w:rPr>
-              <w:t>35.41</w:t>
+              <w:t>61.37</w:t>
             </w:r>
           </w:p>
         </w:tc>
@@ -16899,7 +16899,7 @@
                 <w:rFonts w:ascii="Arial" w:hAnsi="Arial" w:cs="Arial"/>
                 <w:sz w:val="19"/>
               </w:rPr>
-              <w:t xml:space="preserve">23.5 </w:t>
+              <w:t>56.4 ms</w:t>
             </w:r>
             <w:proofErr w:type="spellStart"/>
             <w:r>
@@ -16907,7 +16907,6 @@
                 <w:rFonts w:ascii="Arial" w:hAnsi="Arial" w:cs="Arial"/>
                 <w:sz w:val="19"/>
               </w:rPr>
-              <w:t>ms</w:t>
             </w:r>
             <w:proofErr w:type="spellEnd"/>
           </w:p>
@@ -16927,7 +16926,7 @@
                 <w:rFonts w:ascii="Arial" w:hAnsi="Arial" w:cs="Arial"/>
                 <w:sz w:val="19"/>
               </w:rPr>
-              <w:t>31.7 ms</w:t>
+              <w:t>49.3 ms</w:t>
             </w:r>
           </w:p>
         </w:tc>
@@ -17121,7 +17120,7 @@
                 <w:rFonts w:ascii="Arial" w:hAnsi="Arial" w:cs="Arial"/>
                 <w:sz w:val="19"/>
               </w:rPr>
-              <w:t>499 MB</w:t>
+              <w:t>486 MB</w:t>
             </w:r>
           </w:p>
         </w:tc>

</xml_diff>